<commit_message>
Add Kathbath Hindi eval — 80 rows open-source validation complete
</commit_message>
<xml_diff>
--- a/report.docx
+++ b/report.docx
@@ -1958,7 +1958,480 @@
         <w:spacing w:after="100" w:before="40"/>
       </w:pPr>
       <w:r>
-        <w:t>FLEURS Hindi (20 samples, test split) confirms self-recorded findings: Sarvam outperforms Deepgram on CER (1.382 vs 1.411) and latency (0.72s vs 1.84s). WER ~1.0 on both due to Devanagari reference vs Roman output script mismatch — expected, not a failure. Results are not an artifact of self-recording quality.</w:t>
+        <w:t>Two open-source Hindi datasets validated findings beyond self-recorded audio. FLEURS Hindi (20 samples, test split) is clean read speech with diverse regional accents. Kathbath Hindi (20 samples, valid split) is conversational speech from 1,218 contributors across 203 districts in India — closest to production conditions. References are Devanagari script; model outputs are Roman — WER ~1.0 expected on both due to script mismatch. CER is the valid metric:</w:t>
+      </w:r>
+    </w:p>
+    <w:tbl>
+      <w:tblPr>
+        <w:tblStyle w:val="TableGrid"/>
+        <w:tblW w:type="auto" w:w="0"/>
+        <w:jc w:val="center"/>
+        <w:tblLook w:firstColumn="1" w:firstRow="1" w:lastColumn="0" w:lastRow="0" w:noHBand="0" w:noVBand="1" w:val="04A0"/>
+      </w:tblPr>
+      <w:tblGrid>
+        <w:gridCol w:w="1872"/>
+        <w:gridCol w:w="1872"/>
+        <w:gridCol w:w="1872"/>
+        <w:gridCol w:w="1872"/>
+        <w:gridCol w:w="1872"/>
+      </w:tblGrid>
+      <w:tr>
+        <w:tc>
+          <w:tcPr>
+            <w:tcW w:type="dxa" w:w="2592"/>
+            <w:shd w:val="clear" w:color="auto" w:fill="1F497D"/>
+          </w:tcPr>
+          <w:p>
+            <w:pPr>
+              <w:jc w:val="center"/>
+            </w:pPr>
+            <w:r>
+              <w:rPr>
+                <w:b/>
+                <w:color w:val="FFFFFF"/>
+                <w:sz w:val="18"/>
+              </w:rPr>
+              <w:t>Dataset</w:t>
+            </w:r>
+          </w:p>
+        </w:tc>
+        <w:tc>
+          <w:tcPr>
+            <w:tcW w:type="dxa" w:w="2880"/>
+            <w:shd w:val="clear" w:color="auto" w:fill="1F497D"/>
+          </w:tcPr>
+          <w:p>
+            <w:pPr>
+              <w:jc w:val="center"/>
+            </w:pPr>
+            <w:r>
+              <w:rPr>
+                <w:b/>
+                <w:color w:val="FFFFFF"/>
+                <w:sz w:val="18"/>
+              </w:rPr>
+              <w:t>Model</w:t>
+            </w:r>
+          </w:p>
+        </w:tc>
+        <w:tc>
+          <w:tcPr>
+            <w:tcW w:type="dxa" w:w="1872"/>
+            <w:shd w:val="clear" w:color="auto" w:fill="1F497D"/>
+          </w:tcPr>
+          <w:p>
+            <w:pPr>
+              <w:jc w:val="center"/>
+            </w:pPr>
+            <w:r>
+              <w:rPr>
+                <w:b/>
+                <w:color w:val="FFFFFF"/>
+                <w:sz w:val="18"/>
+              </w:rPr>
+              <w:t>Mean WER</w:t>
+            </w:r>
+          </w:p>
+        </w:tc>
+        <w:tc>
+          <w:tcPr>
+            <w:tcW w:type="dxa" w:w="1872"/>
+            <w:shd w:val="clear" w:color="auto" w:fill="1F497D"/>
+          </w:tcPr>
+          <w:p>
+            <w:pPr>
+              <w:jc w:val="center"/>
+            </w:pPr>
+            <w:r>
+              <w:rPr>
+                <w:b/>
+                <w:color w:val="FFFFFF"/>
+                <w:sz w:val="18"/>
+              </w:rPr>
+              <w:t>Mean CER</w:t>
+            </w:r>
+          </w:p>
+        </w:tc>
+        <w:tc>
+          <w:tcPr>
+            <w:tcW w:type="dxa" w:w="2304"/>
+            <w:shd w:val="clear" w:color="auto" w:fill="1F497D"/>
+          </w:tcPr>
+          <w:p>
+            <w:pPr>
+              <w:jc w:val="center"/>
+            </w:pPr>
+            <w:r>
+              <w:rPr>
+                <w:b/>
+                <w:color w:val="FFFFFF"/>
+                <w:sz w:val="18"/>
+              </w:rPr>
+              <w:t>Mean Latency</w:t>
+            </w:r>
+          </w:p>
+        </w:tc>
+      </w:tr>
+      <w:tr>
+        <w:tc>
+          <w:tcPr>
+            <w:tcW w:type="dxa" w:w="2592"/>
+            <w:shd w:val="clear" w:color="auto" w:fill="F2F7FC"/>
+          </w:tcPr>
+          <w:p>
+            <w:pPr>
+              <w:jc w:val="center"/>
+            </w:pPr>
+            <w:r>
+              <w:rPr>
+                <w:sz w:val="18"/>
+              </w:rPr>
+              <w:t>FLEURS Hindi</w:t>
+            </w:r>
+          </w:p>
+        </w:tc>
+        <w:tc>
+          <w:tcPr>
+            <w:tcW w:type="dxa" w:w="2880"/>
+            <w:shd w:val="clear" w:color="auto" w:fill="F2F7FC"/>
+          </w:tcPr>
+          <w:p>
+            <w:pPr>
+              <w:jc w:val="center"/>
+            </w:pPr>
+            <w:r>
+              <w:rPr>
+                <w:sz w:val="18"/>
+              </w:rPr>
+              <w:t>Deepgram Nova-2</w:t>
+            </w:r>
+          </w:p>
+        </w:tc>
+        <w:tc>
+          <w:tcPr>
+            <w:tcW w:type="dxa" w:w="1872"/>
+            <w:shd w:val="clear" w:color="auto" w:fill="F2F7FC"/>
+          </w:tcPr>
+          <w:p>
+            <w:pPr>
+              <w:jc w:val="center"/>
+            </w:pPr>
+            <w:r>
+              <w:rPr>
+                <w:sz w:val="18"/>
+              </w:rPr>
+              <w:t>1.007</w:t>
+            </w:r>
+          </w:p>
+        </w:tc>
+        <w:tc>
+          <w:tcPr>
+            <w:tcW w:type="dxa" w:w="1872"/>
+            <w:shd w:val="clear" w:color="auto" w:fill="F2F7FC"/>
+          </w:tcPr>
+          <w:p>
+            <w:pPr>
+              <w:jc w:val="center"/>
+            </w:pPr>
+            <w:r>
+              <w:rPr>
+                <w:sz w:val="18"/>
+              </w:rPr>
+              <w:t>1.411</w:t>
+            </w:r>
+          </w:p>
+        </w:tc>
+        <w:tc>
+          <w:tcPr>
+            <w:tcW w:type="dxa" w:w="2304"/>
+            <w:shd w:val="clear" w:color="auto" w:fill="F2F7FC"/>
+          </w:tcPr>
+          <w:p>
+            <w:pPr>
+              <w:jc w:val="center"/>
+            </w:pPr>
+            <w:r>
+              <w:rPr>
+                <w:sz w:val="18"/>
+              </w:rPr>
+              <w:t>0.58s</w:t>
+            </w:r>
+          </w:p>
+        </w:tc>
+      </w:tr>
+      <w:tr>
+        <w:tc>
+          <w:tcPr>
+            <w:tcW w:type="dxa" w:w="2592"/>
+            <w:shd w:val="clear" w:color="auto" w:fill="FFFFFF"/>
+          </w:tcPr>
+          <w:p>
+            <w:pPr>
+              <w:jc w:val="center"/>
+            </w:pPr>
+            <w:r>
+              <w:rPr>
+                <w:sz w:val="18"/>
+              </w:rPr>
+              <w:t>FLEURS Hindi</w:t>
+            </w:r>
+          </w:p>
+        </w:tc>
+        <w:tc>
+          <w:tcPr>
+            <w:tcW w:type="dxa" w:w="2880"/>
+            <w:shd w:val="clear" w:color="auto" w:fill="FFFFFF"/>
+          </w:tcPr>
+          <w:p>
+            <w:pPr>
+              <w:jc w:val="center"/>
+            </w:pPr>
+            <w:r>
+              <w:rPr>
+                <w:sz w:val="18"/>
+              </w:rPr>
+              <w:t>Sarvam Saaras v3</w:t>
+            </w:r>
+          </w:p>
+        </w:tc>
+        <w:tc>
+          <w:tcPr>
+            <w:tcW w:type="dxa" w:w="1872"/>
+            <w:shd w:val="clear" w:color="auto" w:fill="FFFFFF"/>
+          </w:tcPr>
+          <w:p>
+            <w:pPr>
+              <w:jc w:val="center"/>
+            </w:pPr>
+            <w:r>
+              <w:rPr>
+                <w:sz w:val="18"/>
+              </w:rPr>
+              <w:t>1.001</w:t>
+            </w:r>
+          </w:p>
+        </w:tc>
+        <w:tc>
+          <w:tcPr>
+            <w:tcW w:type="dxa" w:w="1872"/>
+            <w:shd w:val="clear" w:color="auto" w:fill="FFFFFF"/>
+          </w:tcPr>
+          <w:p>
+            <w:pPr>
+              <w:jc w:val="center"/>
+            </w:pPr>
+            <w:r>
+              <w:rPr>
+                <w:sz w:val="18"/>
+              </w:rPr>
+              <w:t>1.382 ✓</w:t>
+            </w:r>
+          </w:p>
+        </w:tc>
+        <w:tc>
+          <w:tcPr>
+            <w:tcW w:type="dxa" w:w="2304"/>
+            <w:shd w:val="clear" w:color="auto" w:fill="FFFFFF"/>
+          </w:tcPr>
+          <w:p>
+            <w:pPr>
+              <w:jc w:val="center"/>
+            </w:pPr>
+            <w:r>
+              <w:rPr>
+                <w:sz w:val="18"/>
+              </w:rPr>
+              <w:t>1.07s</w:t>
+            </w:r>
+          </w:p>
+        </w:tc>
+      </w:tr>
+      <w:tr>
+        <w:tc>
+          <w:tcPr>
+            <w:tcW w:type="dxa" w:w="2592"/>
+            <w:shd w:val="clear" w:color="auto" w:fill="F2F7FC"/>
+          </w:tcPr>
+          <w:p>
+            <w:pPr>
+              <w:jc w:val="center"/>
+            </w:pPr>
+            <w:r>
+              <w:rPr>
+                <w:sz w:val="18"/>
+              </w:rPr>
+              <w:t>Kathbath Hindi</w:t>
+            </w:r>
+          </w:p>
+        </w:tc>
+        <w:tc>
+          <w:tcPr>
+            <w:tcW w:type="dxa" w:w="2880"/>
+            <w:shd w:val="clear" w:color="auto" w:fill="F2F7FC"/>
+          </w:tcPr>
+          <w:p>
+            <w:pPr>
+              <w:jc w:val="center"/>
+            </w:pPr>
+            <w:r>
+              <w:rPr>
+                <w:sz w:val="18"/>
+              </w:rPr>
+              <w:t>Deepgram Nova-2</w:t>
+            </w:r>
+          </w:p>
+        </w:tc>
+        <w:tc>
+          <w:tcPr>
+            <w:tcW w:type="dxa" w:w="1872"/>
+            <w:shd w:val="clear" w:color="auto" w:fill="F2F7FC"/>
+          </w:tcPr>
+          <w:p>
+            <w:pPr>
+              <w:jc w:val="center"/>
+            </w:pPr>
+            <w:r>
+              <w:rPr>
+                <w:sz w:val="18"/>
+              </w:rPr>
+              <w:t>1.023</w:t>
+            </w:r>
+          </w:p>
+        </w:tc>
+        <w:tc>
+          <w:tcPr>
+            <w:tcW w:type="dxa" w:w="1872"/>
+            <w:shd w:val="clear" w:color="auto" w:fill="F2F7FC"/>
+          </w:tcPr>
+          <w:p>
+            <w:pPr>
+              <w:jc w:val="center"/>
+            </w:pPr>
+            <w:r>
+              <w:rPr>
+                <w:sz w:val="18"/>
+              </w:rPr>
+              <w:t>1.425</w:t>
+            </w:r>
+          </w:p>
+        </w:tc>
+        <w:tc>
+          <w:tcPr>
+            <w:tcW w:type="dxa" w:w="2304"/>
+            <w:shd w:val="clear" w:color="auto" w:fill="F2F7FC"/>
+          </w:tcPr>
+          <w:p>
+            <w:pPr>
+              <w:jc w:val="center"/>
+            </w:pPr>
+            <w:r>
+              <w:rPr>
+                <w:sz w:val="18"/>
+              </w:rPr>
+              <w:t>0.72s</w:t>
+            </w:r>
+          </w:p>
+        </w:tc>
+      </w:tr>
+      <w:tr>
+        <w:tc>
+          <w:tcPr>
+            <w:tcW w:type="dxa" w:w="2592"/>
+            <w:shd w:val="clear" w:color="auto" w:fill="FFFFFF"/>
+          </w:tcPr>
+          <w:p>
+            <w:pPr>
+              <w:jc w:val="center"/>
+            </w:pPr>
+            <w:r>
+              <w:rPr>
+                <w:sz w:val="18"/>
+              </w:rPr>
+              <w:t>Kathbath Hindi</w:t>
+            </w:r>
+          </w:p>
+        </w:tc>
+        <w:tc>
+          <w:tcPr>
+            <w:tcW w:type="dxa" w:w="2880"/>
+            <w:shd w:val="clear" w:color="auto" w:fill="FFFFFF"/>
+          </w:tcPr>
+          <w:p>
+            <w:pPr>
+              <w:jc w:val="center"/>
+            </w:pPr>
+            <w:r>
+              <w:rPr>
+                <w:sz w:val="18"/>
+              </w:rPr>
+              <w:t>Sarvam Saaras v3</w:t>
+            </w:r>
+          </w:p>
+        </w:tc>
+        <w:tc>
+          <w:tcPr>
+            <w:tcW w:type="dxa" w:w="1872"/>
+            <w:shd w:val="clear" w:color="auto" w:fill="FFFFFF"/>
+          </w:tcPr>
+          <w:p>
+            <w:pPr>
+              <w:jc w:val="center"/>
+            </w:pPr>
+            <w:r>
+              <w:rPr>
+                <w:sz w:val="18"/>
+              </w:rPr>
+              <w:t>1.018</w:t>
+            </w:r>
+          </w:p>
+        </w:tc>
+        <w:tc>
+          <w:tcPr>
+            <w:tcW w:type="dxa" w:w="1872"/>
+            <w:shd w:val="clear" w:color="auto" w:fill="FFFFFF"/>
+          </w:tcPr>
+          <w:p>
+            <w:pPr>
+              <w:jc w:val="center"/>
+            </w:pPr>
+            <w:r>
+              <w:rPr>
+                <w:sz w:val="18"/>
+              </w:rPr>
+              <w:t>1.410 ✓</w:t>
+            </w:r>
+          </w:p>
+        </w:tc>
+        <w:tc>
+          <w:tcPr>
+            <w:tcW w:type="dxa" w:w="2304"/>
+            <w:shd w:val="clear" w:color="auto" w:fill="FFFFFF"/>
+          </w:tcPr>
+          <w:p>
+            <w:pPr>
+              <w:jc w:val="center"/>
+            </w:pPr>
+            <w:r>
+              <w:rPr>
+                <w:sz w:val="18"/>
+              </w:rPr>
+              <w:t>0.59s</w:t>
+            </w:r>
+          </w:p>
+        </w:tc>
+      </w:tr>
+    </w:tbl>
+    <w:p>
+      <w:pPr>
+        <w:spacing w:after="80"/>
+      </w:pPr>
+    </w:p>
+    <w:p>
+      <w:pPr>
+        <w:spacing w:after="100" w:before="40"/>
+      </w:pPr>
+      <w:r>
+        <w:t>Sarvam's CER advantage holds on both datasets. On Kathbath (conversational), the gap narrows — 1.410 vs 1.425 — suggesting both models find spontaneous speech harder than read speech. Self-recorded findings generalize to external data.</w:t>
       </w:r>
     </w:p>
     <w:p>

</xml_diff>